<commit_message>
Overhaul App, Functions, and Necessary Files
Overhaul App, Functions, and Necessary Files
Updated the function files, shiny standards, and the app to completely overhaul the code. Built it to be easier to make updates to later. Added "fine regions" to the list of default region types which also updated all Necessary Files. Added "inclusions per mm^2" back into value options (last seen in N2U).
</commit_message>
<xml_diff>
--- a/M2U_Protocol.docx
+++ b/M2U_Protocol.docx
@@ -482,21 +482,7 @@
         <w:rPr>
           <w:rFonts w:cstheme="minorHAnsi"/>
         </w:rPr>
-        <w:t xml:space="preserve">First, create a folder which will contain all your data for this project and </w:t>
-      </w:r>
-      <w:proofErr w:type="gramStart"/>
-      <w:r>
-        <w:rPr>
-          <w:rFonts w:cstheme="minorHAnsi"/>
-        </w:rPr>
-        <w:t>name it</w:t>
-      </w:r>
-      <w:proofErr w:type="gramEnd"/>
-      <w:r>
-        <w:rPr>
-          <w:rFonts w:cstheme="minorHAnsi"/>
-        </w:rPr>
-        <w:t xml:space="preserve"> whatever you would like. </w:t>
+        <w:t xml:space="preserve">First, create a folder which will contain all your data for this project and name it whatever you would like. </w:t>
       </w:r>
       <w:r>
         <w:rPr>
@@ -756,63 +742,39 @@
         <w:rPr>
           <w:rFonts w:cstheme="minorHAnsi"/>
         </w:rPr>
-        <w:t xml:space="preserve">annotations are separate and can contain the following information: </w:t>
-      </w:r>
-      <w:r>
-        <w:rPr>
-          <w:rFonts w:cstheme="minorHAnsi"/>
-          <w:b/>
-          <w:bCs/>
-        </w:rPr>
-        <w:t>"mouse",</w:t>
-      </w:r>
-      <w:r>
-        <w:rPr>
-          <w:rFonts w:cstheme="minorHAnsi"/>
-          <w:b/>
-          <w:bCs/>
-        </w:rPr>
-        <w:t xml:space="preserve"> </w:t>
-      </w:r>
-      <w:r>
-        <w:rPr>
-          <w:rFonts w:cstheme="minorHAnsi"/>
-          <w:b/>
-          <w:bCs/>
-        </w:rPr>
-        <w:t>"sex",</w:t>
-      </w:r>
-      <w:r>
-        <w:rPr>
-          <w:rFonts w:cstheme="minorHAnsi"/>
-          <w:b/>
-          <w:bCs/>
-        </w:rPr>
-        <w:t xml:space="preserve"> </w:t>
-      </w:r>
-      <w:r>
-        <w:rPr>
-          <w:rFonts w:cstheme="minorHAnsi"/>
-          <w:b/>
-          <w:bCs/>
-        </w:rPr>
-        <w:t>"treatment",</w:t>
-      </w:r>
-      <w:r>
-        <w:rPr>
-          <w:rFonts w:cstheme="minorHAnsi"/>
-          <w:b/>
-          <w:bCs/>
-        </w:rPr>
-        <w:t xml:space="preserve"> </w:t>
-      </w:r>
-      <w:r>
-        <w:rPr>
-          <w:rFonts w:cstheme="minorHAnsi"/>
-          <w:b/>
-          <w:bCs/>
-        </w:rPr>
-        <w:t>"</w:t>
+        <w:t xml:space="preserve">annotations are </w:t>
+      </w:r>
+      <w:r>
+        <w:rPr>
+          <w:rFonts w:cstheme="minorHAnsi"/>
+        </w:rPr>
+        <w:t xml:space="preserve">done later and </w:t>
+      </w:r>
+      <w:r>
+        <w:rPr>
+          <w:rFonts w:cstheme="minorHAnsi"/>
+        </w:rPr>
+        <w:t>separat</w:t>
+      </w:r>
+      <w:r>
+        <w:rPr>
+          <w:rFonts w:cstheme="minorHAnsi"/>
+        </w:rPr>
+        <w:t>ely</w:t>
+      </w:r>
+      <w:r>
+        <w:rPr>
+          <w:rFonts w:cstheme="minorHAnsi"/>
+        </w:rPr>
+        <w:t xml:space="preserve"> and can contain the following information: </w:t>
+      </w:r>
+      <w:r>
+        <w:rPr>
+          <w:rFonts w:cstheme="minorHAnsi"/>
+          <w:b/>
+          <w:bCs/>
+        </w:rPr>
+        <w:t>"mouse", "sex", "treatment", "</w:t>
       </w:r>
       <w:proofErr w:type="spellStart"/>
       <w:r>
@@ -830,61 +792,25 @@
           <w:b/>
           <w:bCs/>
         </w:rPr>
-        <w:t>",</w:t>
-      </w:r>
-      <w:r>
-        <w:rPr>
-          <w:rFonts w:cstheme="minorHAnsi"/>
-          <w:b/>
-          <w:bCs/>
-        </w:rPr>
-        <w:t xml:space="preserve"> </w:t>
-      </w:r>
-      <w:r>
-        <w:rPr>
-          <w:rFonts w:cstheme="minorHAnsi"/>
-          <w:b/>
-          <w:bCs/>
-        </w:rPr>
-        <w:t>"genotype",</w:t>
-      </w:r>
-      <w:r>
-        <w:rPr>
-          <w:rFonts w:cstheme="minorHAnsi"/>
-          <w:b/>
-          <w:bCs/>
-        </w:rPr>
-        <w:t xml:space="preserve"> </w:t>
-      </w:r>
-      <w:r>
-        <w:rPr>
-          <w:rFonts w:cstheme="minorHAnsi"/>
-          <w:b/>
-          <w:bCs/>
-        </w:rPr>
-        <w:t>"marker",</w:t>
-      </w:r>
-      <w:r>
-        <w:rPr>
-          <w:rFonts w:cstheme="minorHAnsi"/>
-          <w:b/>
-          <w:bCs/>
-        </w:rPr>
-        <w:t xml:space="preserve"> and </w:t>
-      </w:r>
-      <w:r>
-        <w:rPr>
-          <w:rFonts w:cstheme="minorHAnsi"/>
-          <w:b/>
-          <w:bCs/>
-        </w:rPr>
-        <w:t>"batch"</w:t>
-      </w:r>
-      <w:r>
-        <w:rPr>
-          <w:rFonts w:cstheme="minorHAnsi"/>
-        </w:rPr>
-        <w:t>. If you have this information and are interested in comparing it, please make sure to</w:t>
+        <w:t>", "genotype", "marker", and "batch"</w:t>
+      </w:r>
+      <w:r>
+        <w:rPr>
+          <w:rFonts w:cstheme="minorHAnsi"/>
+        </w:rPr>
+        <w:t>. If you have this information and are interested in comparing</w:t>
+      </w:r>
+      <w:r>
+        <w:rPr>
+          <w:rFonts w:cstheme="minorHAnsi"/>
+        </w:rPr>
+        <w:t xml:space="preserve"> with</w:t>
+      </w:r>
+      <w:r>
+        <w:rPr>
+          <w:rFonts w:cstheme="minorHAnsi"/>
+        </w:rPr>
+        <w:t xml:space="preserve"> it, please make sure to</w:t>
       </w:r>
       <w:r>
         <w:rPr>
@@ -1238,13 +1164,7 @@
         <w:rPr>
           <w:rFonts w:cstheme="minorHAnsi"/>
         </w:rPr>
-        <w:t xml:space="preserve">Move to the </w:t>
-      </w:r>
-      <w:r>
-        <w:rPr>
-          <w:rFonts w:cstheme="minorHAnsi"/>
-        </w:rPr>
-        <w:t>“Annotation Creation” sub-tab</w:t>
+        <w:t>Move to the “Annotation Creation” sub-tab</w:t>
       </w:r>
     </w:p>
     <w:p>
@@ -1263,25 +1183,13 @@
           <w:rFonts w:cstheme="minorHAnsi"/>
         </w:rPr>
         <w:lastRenderedPageBreak/>
-        <w:t xml:space="preserve">If you need to step away from the application at this point, you will need to upload the raw data </w:t>
-      </w:r>
-      <w:r>
-        <w:rPr>
-          <w:rFonts w:cstheme="minorHAnsi"/>
-        </w:rPr>
-        <w:t xml:space="preserve">in the “Annotation Creation” </w:t>
-      </w:r>
-      <w:r>
-        <w:rPr>
-          <w:rFonts w:cstheme="minorHAnsi"/>
-        </w:rPr>
-        <w:t>sub-tab</w:t>
-      </w:r>
-      <w:r>
-        <w:rPr>
-          <w:rFonts w:cstheme="minorHAnsi"/>
-        </w:rPr>
-        <w:t xml:space="preserve"> </w:t>
+        <w:t xml:space="preserve">If you need to step away from the application at this point, you will need to upload the raw data in the “Annotation Creation” </w:t>
+      </w:r>
+      <w:r>
+        <w:rPr>
+          <w:rFonts w:cstheme="minorHAnsi"/>
+        </w:rPr>
+        <w:t xml:space="preserve">sub-tab </w:t>
       </w:r>
       <w:r>
         <w:rPr>
@@ -1582,21 +1490,7 @@
         <w:rPr>
           <w:rFonts w:cstheme="minorHAnsi"/>
         </w:rPr>
-        <w:t xml:space="preserve">lick the </w:t>
-      </w:r>
-      <w:proofErr w:type="gramStart"/>
-      <w:r>
-        <w:rPr>
-          <w:rFonts w:cstheme="minorHAnsi"/>
-        </w:rPr>
-        <w:t>browse</w:t>
-      </w:r>
-      <w:proofErr w:type="gramEnd"/>
-      <w:r>
-        <w:rPr>
-          <w:rFonts w:cstheme="minorHAnsi"/>
-        </w:rPr>
-        <w:t xml:space="preserve"> button to</w:t>
+        <w:t>lick the browse button to</w:t>
       </w:r>
       <w:r>
         <w:rPr>
@@ -1633,16 +1527,8 @@
         <w:rPr>
           <w:rFonts w:cstheme="minorHAnsi"/>
         </w:rPr>
-        <w:t xml:space="preserve"> </w:t>
-      </w:r>
-      <w:proofErr w:type="gramStart"/>
-      <w:r>
-        <w:rPr>
-          <w:rFonts w:cstheme="minorHAnsi"/>
-        </w:rPr>
-        <w:t>completed</w:t>
-      </w:r>
-      <w:proofErr w:type="gramEnd"/>
+        <w:t xml:space="preserve"> completed</w:t>
+      </w:r>
       <w:r>
         <w:rPr>
           <w:rFonts w:cstheme="minorHAnsi"/>
@@ -2564,7 +2450,19 @@
         <w:rPr>
           <w:rFonts w:cstheme="minorHAnsi"/>
         </w:rPr>
-        <w:t xml:space="preserve">There may be an option called </w:t>
+        <w:t>There may be option</w:t>
+      </w:r>
+      <w:r>
+        <w:rPr>
+          <w:rFonts w:cstheme="minorHAnsi"/>
+        </w:rPr>
+        <w:t>s</w:t>
+      </w:r>
+      <w:r>
+        <w:rPr>
+          <w:rFonts w:cstheme="minorHAnsi"/>
+        </w:rPr>
+        <w:t xml:space="preserve"> called </w:t>
       </w:r>
       <w:r>
         <w:rPr>
@@ -2576,19 +2474,43 @@
         <w:rPr>
           <w:rFonts w:cstheme="minorHAnsi"/>
         </w:rPr>
+        <w:t xml:space="preserve"> or ‘InclusionsPerMM2’</w:t>
+      </w:r>
+      <w:r>
+        <w:rPr>
+          <w:rFonts w:cstheme="minorHAnsi"/>
+        </w:rPr>
         <w:t xml:space="preserve"> which </w:t>
       </w:r>
       <w:r>
         <w:rPr>
           <w:rFonts w:cstheme="minorHAnsi"/>
         </w:rPr>
-        <w:t>is a</w:t>
-      </w:r>
-      <w:r>
-        <w:rPr>
-          <w:rFonts w:cstheme="minorHAnsi"/>
-        </w:rPr>
-        <w:t xml:space="preserve"> calculation run in the app</w:t>
+        <w:t>a</w:t>
+      </w:r>
+      <w:r>
+        <w:rPr>
+          <w:rFonts w:cstheme="minorHAnsi"/>
+        </w:rPr>
+        <w:t>re</w:t>
+      </w:r>
+      <w:r>
+        <w:rPr>
+          <w:rFonts w:cstheme="minorHAnsi"/>
+        </w:rPr>
+        <w:t xml:space="preserve"> calculation</w:t>
+      </w:r>
+      <w:r>
+        <w:rPr>
+          <w:rFonts w:cstheme="minorHAnsi"/>
+        </w:rPr>
+        <w:t>s</w:t>
+      </w:r>
+      <w:r>
+        <w:rPr>
+          <w:rFonts w:cstheme="minorHAnsi"/>
+        </w:rPr>
+        <w:t xml:space="preserve"> run in the app</w:t>
       </w:r>
       <w:r>
         <w:rPr>
@@ -2644,13 +2566,7 @@
         <w:rPr>
           <w:rFonts w:cstheme="minorHAnsi"/>
         </w:rPr>
-        <w:t>i</w:t>
-      </w:r>
-      <w:r>
-        <w:rPr>
-          <w:rFonts w:cstheme="minorHAnsi"/>
-        </w:rPr>
-        <w:t>t</w:t>
+        <w:t>them</w:t>
       </w:r>
     </w:p>
     <w:p>
@@ -2669,21 +2585,7 @@
         <w:rPr>
           <w:rFonts w:cstheme="minorHAnsi"/>
         </w:rPr>
-        <w:t xml:space="preserve">Move the following </w:t>
-      </w:r>
-      <w:proofErr w:type="gramStart"/>
-      <w:r>
-        <w:rPr>
-          <w:rFonts w:cstheme="minorHAnsi"/>
-        </w:rPr>
-        <w:t>sliders</w:t>
-      </w:r>
-      <w:proofErr w:type="gramEnd"/>
-      <w:r>
-        <w:rPr>
-          <w:rFonts w:cstheme="minorHAnsi"/>
-        </w:rPr>
-        <w:t xml:space="preserve"> as you see fit</w:t>
+        <w:t>Move the following sliders as you see fit</w:t>
       </w:r>
     </w:p>
     <w:p>
@@ -2721,37 +2623,7 @@
         <w:rPr>
           <w:rFonts w:cstheme="minorHAnsi"/>
         </w:rPr>
-        <w:t xml:space="preserve">Trim refers to </w:t>
-      </w:r>
-      <w:r>
-        <w:rPr>
-          <w:rFonts w:cstheme="minorHAnsi"/>
-        </w:rPr>
-        <w:t>remov</w:t>
-      </w:r>
-      <w:r>
-        <w:rPr>
-          <w:rFonts w:cstheme="minorHAnsi"/>
-        </w:rPr>
-        <w:t>ing</w:t>
-      </w:r>
-      <w:r>
-        <w:rPr>
-          <w:rFonts w:cstheme="minorHAnsi"/>
-        </w:rPr>
-        <w:t xml:space="preserve"> any column</w:t>
-      </w:r>
-      <w:r>
-        <w:rPr>
-          <w:rFonts w:cstheme="minorHAnsi"/>
-        </w:rPr>
-        <w:t>/row</w:t>
-      </w:r>
-      <w:r>
-        <w:rPr>
-          <w:rFonts w:cstheme="minorHAnsi"/>
-        </w:rPr>
-        <w:t xml:space="preserve"> with more than 50% of the data missing</w:t>
+        <w:t>Trim refers to removing any column/row with more than 50% of the data missing</w:t>
       </w:r>
     </w:p>
     <w:p>
@@ -2955,21 +2827,7 @@
         <w:rPr>
           <w:rFonts w:cstheme="minorHAnsi"/>
         </w:rPr>
-        <w:t xml:space="preserve">Once it is done loading, the downloads will </w:t>
-      </w:r>
-      <w:proofErr w:type="gramStart"/>
-      <w:r>
-        <w:rPr>
-          <w:rFonts w:cstheme="minorHAnsi"/>
-        </w:rPr>
-        <w:t>open</w:t>
-      </w:r>
-      <w:proofErr w:type="gramEnd"/>
-      <w:r>
-        <w:rPr>
-          <w:rFonts w:cstheme="minorHAnsi"/>
-        </w:rPr>
-        <w:t xml:space="preserve"> and I highly recommend you download both</w:t>
+        <w:t>Once it is done loading, the downloads will open and I highly recommend you download both</w:t>
       </w:r>
     </w:p>
     <w:p>
@@ -3723,6 +3581,162 @@
           <w:rFonts w:cstheme="minorHAnsi"/>
         </w:rPr>
         <w:t>to get an accurate load for the larger region.</w:t>
+      </w:r>
+    </w:p>
+    <w:p>
+      <w:pPr>
+        <w:pStyle w:val="ListParagraph"/>
+        <w:numPr>
+          <w:ilvl w:val="0"/>
+          <w:numId w:val="7"/>
+        </w:numPr>
+        <w:rPr>
+          <w:rFonts w:cstheme="minorHAnsi"/>
+        </w:rPr>
+      </w:pPr>
+      <w:r>
+        <w:rPr>
+          <w:rFonts w:cstheme="minorHAnsi"/>
+          <w:b/>
+          <w:bCs/>
+        </w:rPr>
+        <w:t>Inclusions/mm^2:</w:t>
+      </w:r>
+      <w:r>
+        <w:rPr>
+          <w:rFonts w:cstheme="minorHAnsi"/>
+        </w:rPr>
+        <w:t xml:space="preserve"> This measure calculates the density of positive cells in each parent or daughter region at the mm^2 level. The measure is derived from taking the Nutil columns </w:t>
+      </w:r>
+      <w:r>
+        <w:rPr>
+          <w:rFonts w:cstheme="minorHAnsi"/>
+          <w:i/>
+          <w:iCs/>
+        </w:rPr>
+        <w:t>Object Count</w:t>
+      </w:r>
+      <w:r>
+        <w:rPr>
+          <w:rFonts w:cstheme="minorHAnsi"/>
+        </w:rPr>
+        <w:t xml:space="preserve"> and </w:t>
+      </w:r>
+      <w:r>
+        <w:rPr>
+          <w:rFonts w:cstheme="minorHAnsi"/>
+          <w:i/>
+          <w:iCs/>
+        </w:rPr>
+        <w:t>Region Area (</w:t>
+      </w:r>
+      <w:r>
+        <w:rPr>
+          <w:rFonts w:cstheme="minorHAnsi"/>
+          <w:color w:val="111111"/>
+          <w:shd w:val="clear" w:color="auto" w:fill="FFFFFF"/>
+        </w:rPr>
+        <w:t>μm</w:t>
+      </w:r>
+      <w:r>
+        <w:rPr>
+          <w:rFonts w:cstheme="minorHAnsi"/>
+          <w:i/>
+          <w:iCs/>
+        </w:rPr>
+        <w:t xml:space="preserve">^2): </w:t>
+      </w:r>
+      <w:r>
+        <w:rPr>
+          <w:rFonts w:cstheme="minorHAnsi"/>
+        </w:rPr>
+        <w:t xml:space="preserve">the app divides object counts (+ cells) by the region area converted to mm^2 (area in </w:t>
+      </w:r>
+      <w:r>
+        <w:rPr>
+          <w:rFonts w:cstheme="minorHAnsi"/>
+          <w:color w:val="111111"/>
+          <w:shd w:val="clear" w:color="auto" w:fill="FFFFFF"/>
+        </w:rPr>
+        <w:t>μm</w:t>
+      </w:r>
+      <w:r>
+        <w:rPr>
+          <w:rFonts w:cstheme="minorHAnsi"/>
+        </w:rPr>
+        <w:t>^2 * 10^-6) for each region.</w:t>
+      </w:r>
+      <w:r>
+        <w:rPr>
+          <w:rFonts w:cstheme="minorHAnsi"/>
+        </w:rPr>
+        <w:t xml:space="preserve"> </w:t>
+      </w:r>
+      <w:r>
+        <w:rPr>
+          <w:rFonts w:cstheme="minorHAnsi"/>
+        </w:rPr>
+        <w:t xml:space="preserve">If </w:t>
+      </w:r>
+      <w:r>
+        <w:rPr>
+          <w:rFonts w:cstheme="minorHAnsi"/>
+        </w:rPr>
+        <w:t xml:space="preserve">you select </w:t>
+      </w:r>
+      <w:r>
+        <w:rPr>
+          <w:rFonts w:cstheme="minorHAnsi"/>
+        </w:rPr>
+        <w:t>a region level</w:t>
+      </w:r>
+      <w:r>
+        <w:rPr>
+          <w:rFonts w:cstheme="minorHAnsi"/>
+        </w:rPr>
+        <w:t xml:space="preserve"> higher than daughter, it will add up the sub region areas</w:t>
+      </w:r>
+      <w:r>
+        <w:rPr>
+          <w:rFonts w:cstheme="minorHAnsi"/>
+        </w:rPr>
+        <w:t xml:space="preserve"> and inclusions</w:t>
+      </w:r>
+      <w:r>
+        <w:rPr>
+          <w:rFonts w:cstheme="minorHAnsi"/>
+        </w:rPr>
+        <w:t xml:space="preserve"> and then </w:t>
+      </w:r>
+      <w:r>
+        <w:rPr>
+          <w:rFonts w:cstheme="minorHAnsi"/>
+        </w:rPr>
+        <w:t>use those</w:t>
+      </w:r>
+      <w:r>
+        <w:rPr>
+          <w:rFonts w:cstheme="minorHAnsi"/>
+        </w:rPr>
+        <w:t xml:space="preserve"> for the larger region.</w:t>
+      </w:r>
+    </w:p>
+    <w:p>
+      <w:pPr>
+        <w:pStyle w:val="ListParagraph"/>
+        <w:numPr>
+          <w:ilvl w:val="1"/>
+          <w:numId w:val="7"/>
+        </w:numPr>
+        <w:rPr>
+          <w:rFonts w:cstheme="minorHAnsi"/>
+        </w:rPr>
+      </w:pPr>
+      <w:r>
+        <w:rPr>
+          <w:rFonts w:cstheme="minorHAnsi"/>
+        </w:rPr>
+        <w:t>Be sure you turn off the setting for Object Splitting in Nutil, otherwise you’ll end up with NAs in the column for Object Count in the Nutil outputs and this measure will not run.</w:t>
       </w:r>
     </w:p>
     <w:sectPr>
@@ -4630,6 +4644,18 @@
   </w:num>
   <w:num w:numId="9" w16cid:durableId="1767341401">
     <w:abstractNumId w:val="0"/>
+  </w:num>
+  <w:num w:numId="10" w16cid:durableId="856432134">
+    <w:abstractNumId w:val="5"/>
+    <w:lvlOverride w:ilvl="0"/>
+    <w:lvlOverride w:ilvl="1"/>
+    <w:lvlOverride w:ilvl="2"/>
+    <w:lvlOverride w:ilvl="3"/>
+    <w:lvlOverride w:ilvl="4"/>
+    <w:lvlOverride w:ilvl="5"/>
+    <w:lvlOverride w:ilvl="6"/>
+    <w:lvlOverride w:ilvl="7"/>
+    <w:lvlOverride w:ilvl="8"/>
   </w:num>
 </w:numbering>
 </file>
@@ -5059,6 +5085,7 @@
   <w:style w:type="character" w:default="1" w:styleId="DefaultParagraphFont">
     <w:name w:val="Default Paragraph Font"/>
     <w:uiPriority w:val="1"/>
+    <w:semiHidden/>
     <w:unhideWhenUsed/>
   </w:style>
   <w:style w:type="table" w:default="1" w:styleId="TableNormal">

</xml_diff>

<commit_message>
fix & docs: Anatomical Regions, Minor Regions, and UI
</commit_message>
<xml_diff>
--- a/M2U_Protocol.docx
+++ b/M2U_Protocol.docx
@@ -482,21 +482,7 @@
         <w:rPr>
           <w:rFonts w:cstheme="minorHAnsi"/>
         </w:rPr>
-        <w:t xml:space="preserve">First, create a folder which will contain all your data for this project and </w:t>
-      </w:r>
-      <w:proofErr w:type="gramStart"/>
-      <w:r>
-        <w:rPr>
-          <w:rFonts w:cstheme="minorHAnsi"/>
-        </w:rPr>
-        <w:t>name it</w:t>
-      </w:r>
-      <w:proofErr w:type="gramEnd"/>
-      <w:r>
-        <w:rPr>
-          <w:rFonts w:cstheme="minorHAnsi"/>
-        </w:rPr>
-        <w:t xml:space="preserve"> whatever you would like. </w:t>
+        <w:t xml:space="preserve">First, create a folder which will contain all your data for this project and name it whatever you would like. </w:t>
       </w:r>
       <w:r>
         <w:rPr>
@@ -756,63 +742,39 @@
         <w:rPr>
           <w:rFonts w:cstheme="minorHAnsi"/>
         </w:rPr>
-        <w:t xml:space="preserve">annotations are separate and can contain the following information: </w:t>
-      </w:r>
-      <w:r>
-        <w:rPr>
-          <w:rFonts w:cstheme="minorHAnsi"/>
-          <w:b/>
-          <w:bCs/>
-        </w:rPr>
-        <w:t>"mouse",</w:t>
-      </w:r>
-      <w:r>
-        <w:rPr>
-          <w:rFonts w:cstheme="minorHAnsi"/>
-          <w:b/>
-          <w:bCs/>
-        </w:rPr>
-        <w:t xml:space="preserve"> </w:t>
-      </w:r>
-      <w:r>
-        <w:rPr>
-          <w:rFonts w:cstheme="minorHAnsi"/>
-          <w:b/>
-          <w:bCs/>
-        </w:rPr>
-        <w:t>"sex",</w:t>
-      </w:r>
-      <w:r>
-        <w:rPr>
-          <w:rFonts w:cstheme="minorHAnsi"/>
-          <w:b/>
-          <w:bCs/>
-        </w:rPr>
-        <w:t xml:space="preserve"> </w:t>
-      </w:r>
-      <w:r>
-        <w:rPr>
-          <w:rFonts w:cstheme="minorHAnsi"/>
-          <w:b/>
-          <w:bCs/>
-        </w:rPr>
-        <w:t>"treatment",</w:t>
-      </w:r>
-      <w:r>
-        <w:rPr>
-          <w:rFonts w:cstheme="minorHAnsi"/>
-          <w:b/>
-          <w:bCs/>
-        </w:rPr>
-        <w:t xml:space="preserve"> </w:t>
-      </w:r>
-      <w:r>
-        <w:rPr>
-          <w:rFonts w:cstheme="minorHAnsi"/>
-          <w:b/>
-          <w:bCs/>
-        </w:rPr>
-        <w:t>"</w:t>
+        <w:t xml:space="preserve">annotations are </w:t>
+      </w:r>
+      <w:r>
+        <w:rPr>
+          <w:rFonts w:cstheme="minorHAnsi"/>
+        </w:rPr>
+        <w:t xml:space="preserve">done later and </w:t>
+      </w:r>
+      <w:r>
+        <w:rPr>
+          <w:rFonts w:cstheme="minorHAnsi"/>
+        </w:rPr>
+        <w:t>separat</w:t>
+      </w:r>
+      <w:r>
+        <w:rPr>
+          <w:rFonts w:cstheme="minorHAnsi"/>
+        </w:rPr>
+        <w:t>ely</w:t>
+      </w:r>
+      <w:r>
+        <w:rPr>
+          <w:rFonts w:cstheme="minorHAnsi"/>
+        </w:rPr>
+        <w:t xml:space="preserve"> and can contain the following information: </w:t>
+      </w:r>
+      <w:r>
+        <w:rPr>
+          <w:rFonts w:cstheme="minorHAnsi"/>
+          <w:b/>
+          <w:bCs/>
+        </w:rPr>
+        <w:t>"mouse", "sex", "treatment", "</w:t>
       </w:r>
       <w:proofErr w:type="spellStart"/>
       <w:r>
@@ -830,61 +792,25 @@
           <w:b/>
           <w:bCs/>
         </w:rPr>
-        <w:t>",</w:t>
-      </w:r>
-      <w:r>
-        <w:rPr>
-          <w:rFonts w:cstheme="minorHAnsi"/>
-          <w:b/>
-          <w:bCs/>
-        </w:rPr>
-        <w:t xml:space="preserve"> </w:t>
-      </w:r>
-      <w:r>
-        <w:rPr>
-          <w:rFonts w:cstheme="minorHAnsi"/>
-          <w:b/>
-          <w:bCs/>
-        </w:rPr>
-        <w:t>"genotype",</w:t>
-      </w:r>
-      <w:r>
-        <w:rPr>
-          <w:rFonts w:cstheme="minorHAnsi"/>
-          <w:b/>
-          <w:bCs/>
-        </w:rPr>
-        <w:t xml:space="preserve"> </w:t>
-      </w:r>
-      <w:r>
-        <w:rPr>
-          <w:rFonts w:cstheme="minorHAnsi"/>
-          <w:b/>
-          <w:bCs/>
-        </w:rPr>
-        <w:t>"marker",</w:t>
-      </w:r>
-      <w:r>
-        <w:rPr>
-          <w:rFonts w:cstheme="minorHAnsi"/>
-          <w:b/>
-          <w:bCs/>
-        </w:rPr>
-        <w:t xml:space="preserve"> and </w:t>
-      </w:r>
-      <w:r>
-        <w:rPr>
-          <w:rFonts w:cstheme="minorHAnsi"/>
-          <w:b/>
-          <w:bCs/>
-        </w:rPr>
-        <w:t>"batch"</w:t>
-      </w:r>
-      <w:r>
-        <w:rPr>
-          <w:rFonts w:cstheme="minorHAnsi"/>
-        </w:rPr>
-        <w:t>. If you have this information and are interested in comparing it, please make sure to</w:t>
+        <w:t>", "genotype", "marker", and "batch"</w:t>
+      </w:r>
+      <w:r>
+        <w:rPr>
+          <w:rFonts w:cstheme="minorHAnsi"/>
+        </w:rPr>
+        <w:t>. If you have this information and are interested in comparing</w:t>
+      </w:r>
+      <w:r>
+        <w:rPr>
+          <w:rFonts w:cstheme="minorHAnsi"/>
+        </w:rPr>
+        <w:t xml:space="preserve"> with</w:t>
+      </w:r>
+      <w:r>
+        <w:rPr>
+          <w:rFonts w:cstheme="minorHAnsi"/>
+        </w:rPr>
+        <w:t xml:space="preserve"> it, please make sure to</w:t>
       </w:r>
       <w:r>
         <w:rPr>
@@ -1238,13 +1164,7 @@
         <w:rPr>
           <w:rFonts w:cstheme="minorHAnsi"/>
         </w:rPr>
-        <w:t xml:space="preserve">Move to the </w:t>
-      </w:r>
-      <w:r>
-        <w:rPr>
-          <w:rFonts w:cstheme="minorHAnsi"/>
-        </w:rPr>
-        <w:t>“Annotation Creation” sub-tab</w:t>
+        <w:t>Move to the “Annotation Creation” sub-tab</w:t>
       </w:r>
     </w:p>
     <w:p>
@@ -1263,25 +1183,13 @@
           <w:rFonts w:cstheme="minorHAnsi"/>
         </w:rPr>
         <w:lastRenderedPageBreak/>
-        <w:t xml:space="preserve">If you need to step away from the application at this point, you will need to upload the raw data </w:t>
-      </w:r>
-      <w:r>
-        <w:rPr>
-          <w:rFonts w:cstheme="minorHAnsi"/>
-        </w:rPr>
-        <w:t xml:space="preserve">in the “Annotation Creation” </w:t>
-      </w:r>
-      <w:r>
-        <w:rPr>
-          <w:rFonts w:cstheme="minorHAnsi"/>
-        </w:rPr>
-        <w:t>sub-tab</w:t>
-      </w:r>
-      <w:r>
-        <w:rPr>
-          <w:rFonts w:cstheme="minorHAnsi"/>
-        </w:rPr>
-        <w:t xml:space="preserve"> </w:t>
+        <w:t xml:space="preserve">If you need to step away from the application at this point, you will need to upload the raw data in the “Annotation Creation” </w:t>
+      </w:r>
+      <w:r>
+        <w:rPr>
+          <w:rFonts w:cstheme="minorHAnsi"/>
+        </w:rPr>
+        <w:t xml:space="preserve">sub-tab </w:t>
       </w:r>
       <w:r>
         <w:rPr>
@@ -1582,21 +1490,7 @@
         <w:rPr>
           <w:rFonts w:cstheme="minorHAnsi"/>
         </w:rPr>
-        <w:t xml:space="preserve">lick the </w:t>
-      </w:r>
-      <w:proofErr w:type="gramStart"/>
-      <w:r>
-        <w:rPr>
-          <w:rFonts w:cstheme="minorHAnsi"/>
-        </w:rPr>
-        <w:t>browse</w:t>
-      </w:r>
-      <w:proofErr w:type="gramEnd"/>
-      <w:r>
-        <w:rPr>
-          <w:rFonts w:cstheme="minorHAnsi"/>
-        </w:rPr>
-        <w:t xml:space="preserve"> button to</w:t>
+        <w:t>lick the browse button to</w:t>
       </w:r>
       <w:r>
         <w:rPr>
@@ -1633,16 +1527,8 @@
         <w:rPr>
           <w:rFonts w:cstheme="minorHAnsi"/>
         </w:rPr>
-        <w:t xml:space="preserve"> </w:t>
-      </w:r>
-      <w:proofErr w:type="gramStart"/>
-      <w:r>
-        <w:rPr>
-          <w:rFonts w:cstheme="minorHAnsi"/>
-        </w:rPr>
-        <w:t>completed</w:t>
-      </w:r>
-      <w:proofErr w:type="gramEnd"/>
+        <w:t xml:space="preserve"> completed</w:t>
+      </w:r>
       <w:r>
         <w:rPr>
           <w:rFonts w:cstheme="minorHAnsi"/>
@@ -2564,7 +2450,19 @@
         <w:rPr>
           <w:rFonts w:cstheme="minorHAnsi"/>
         </w:rPr>
-        <w:t xml:space="preserve">There may be an option called </w:t>
+        <w:t>There may be option</w:t>
+      </w:r>
+      <w:r>
+        <w:rPr>
+          <w:rFonts w:cstheme="minorHAnsi"/>
+        </w:rPr>
+        <w:t>s</w:t>
+      </w:r>
+      <w:r>
+        <w:rPr>
+          <w:rFonts w:cstheme="minorHAnsi"/>
+        </w:rPr>
+        <w:t xml:space="preserve"> called </w:t>
       </w:r>
       <w:r>
         <w:rPr>
@@ -2576,19 +2474,43 @@
         <w:rPr>
           <w:rFonts w:cstheme="minorHAnsi"/>
         </w:rPr>
+        <w:t xml:space="preserve"> or ‘InclusionsPerMM2’</w:t>
+      </w:r>
+      <w:r>
+        <w:rPr>
+          <w:rFonts w:cstheme="minorHAnsi"/>
+        </w:rPr>
         <w:t xml:space="preserve"> which </w:t>
       </w:r>
       <w:r>
         <w:rPr>
           <w:rFonts w:cstheme="minorHAnsi"/>
         </w:rPr>
-        <w:t>is a</w:t>
-      </w:r>
-      <w:r>
-        <w:rPr>
-          <w:rFonts w:cstheme="minorHAnsi"/>
-        </w:rPr>
-        <w:t xml:space="preserve"> calculation run in the app</w:t>
+        <w:t>a</w:t>
+      </w:r>
+      <w:r>
+        <w:rPr>
+          <w:rFonts w:cstheme="minorHAnsi"/>
+        </w:rPr>
+        <w:t>re</w:t>
+      </w:r>
+      <w:r>
+        <w:rPr>
+          <w:rFonts w:cstheme="minorHAnsi"/>
+        </w:rPr>
+        <w:t xml:space="preserve"> calculation</w:t>
+      </w:r>
+      <w:r>
+        <w:rPr>
+          <w:rFonts w:cstheme="minorHAnsi"/>
+        </w:rPr>
+        <w:t>s</w:t>
+      </w:r>
+      <w:r>
+        <w:rPr>
+          <w:rFonts w:cstheme="minorHAnsi"/>
+        </w:rPr>
+        <w:t xml:space="preserve"> run in the app</w:t>
       </w:r>
       <w:r>
         <w:rPr>
@@ -2644,13 +2566,7 @@
         <w:rPr>
           <w:rFonts w:cstheme="minorHAnsi"/>
         </w:rPr>
-        <w:t>i</w:t>
-      </w:r>
-      <w:r>
-        <w:rPr>
-          <w:rFonts w:cstheme="minorHAnsi"/>
-        </w:rPr>
-        <w:t>t</w:t>
+        <w:t>them</w:t>
       </w:r>
     </w:p>
     <w:p>
@@ -2669,21 +2585,7 @@
         <w:rPr>
           <w:rFonts w:cstheme="minorHAnsi"/>
         </w:rPr>
-        <w:t xml:space="preserve">Move the following </w:t>
-      </w:r>
-      <w:proofErr w:type="gramStart"/>
-      <w:r>
-        <w:rPr>
-          <w:rFonts w:cstheme="minorHAnsi"/>
-        </w:rPr>
-        <w:t>sliders</w:t>
-      </w:r>
-      <w:proofErr w:type="gramEnd"/>
-      <w:r>
-        <w:rPr>
-          <w:rFonts w:cstheme="minorHAnsi"/>
-        </w:rPr>
-        <w:t xml:space="preserve"> as you see fit</w:t>
+        <w:t>Move the following sliders as you see fit</w:t>
       </w:r>
     </w:p>
     <w:p>
@@ -2721,37 +2623,7 @@
         <w:rPr>
           <w:rFonts w:cstheme="minorHAnsi"/>
         </w:rPr>
-        <w:t xml:space="preserve">Trim refers to </w:t>
-      </w:r>
-      <w:r>
-        <w:rPr>
-          <w:rFonts w:cstheme="minorHAnsi"/>
-        </w:rPr>
-        <w:t>remov</w:t>
-      </w:r>
-      <w:r>
-        <w:rPr>
-          <w:rFonts w:cstheme="minorHAnsi"/>
-        </w:rPr>
-        <w:t>ing</w:t>
-      </w:r>
-      <w:r>
-        <w:rPr>
-          <w:rFonts w:cstheme="minorHAnsi"/>
-        </w:rPr>
-        <w:t xml:space="preserve"> any column</w:t>
-      </w:r>
-      <w:r>
-        <w:rPr>
-          <w:rFonts w:cstheme="minorHAnsi"/>
-        </w:rPr>
-        <w:t>/row</w:t>
-      </w:r>
-      <w:r>
-        <w:rPr>
-          <w:rFonts w:cstheme="minorHAnsi"/>
-        </w:rPr>
-        <w:t xml:space="preserve"> with more than 50% of the data missing</w:t>
+        <w:t>Trim refers to removing any column/row with more than 50% of the data missing</w:t>
       </w:r>
     </w:p>
     <w:p>
@@ -2955,21 +2827,7 @@
         <w:rPr>
           <w:rFonts w:cstheme="minorHAnsi"/>
         </w:rPr>
-        <w:t xml:space="preserve">Once it is done loading, the downloads will </w:t>
-      </w:r>
-      <w:proofErr w:type="gramStart"/>
-      <w:r>
-        <w:rPr>
-          <w:rFonts w:cstheme="minorHAnsi"/>
-        </w:rPr>
-        <w:t>open</w:t>
-      </w:r>
-      <w:proofErr w:type="gramEnd"/>
-      <w:r>
-        <w:rPr>
-          <w:rFonts w:cstheme="minorHAnsi"/>
-        </w:rPr>
-        <w:t xml:space="preserve"> and I highly recommend you download both</w:t>
+        <w:t>Once it is done loading, the downloads will open and I highly recommend you download both</w:t>
       </w:r>
     </w:p>
     <w:p>
@@ -3723,6 +3581,162 @@
           <w:rFonts w:cstheme="minorHAnsi"/>
         </w:rPr>
         <w:t>to get an accurate load for the larger region.</w:t>
+      </w:r>
+    </w:p>
+    <w:p>
+      <w:pPr>
+        <w:pStyle w:val="ListParagraph"/>
+        <w:numPr>
+          <w:ilvl w:val="0"/>
+          <w:numId w:val="7"/>
+        </w:numPr>
+        <w:rPr>
+          <w:rFonts w:cstheme="minorHAnsi"/>
+        </w:rPr>
+      </w:pPr>
+      <w:r>
+        <w:rPr>
+          <w:rFonts w:cstheme="minorHAnsi"/>
+          <w:b/>
+          <w:bCs/>
+        </w:rPr>
+        <w:t>Inclusions/mm^2:</w:t>
+      </w:r>
+      <w:r>
+        <w:rPr>
+          <w:rFonts w:cstheme="minorHAnsi"/>
+        </w:rPr>
+        <w:t xml:space="preserve"> This measure calculates the density of positive cells in each parent or daughter region at the mm^2 level. The measure is derived from taking the Nutil columns </w:t>
+      </w:r>
+      <w:r>
+        <w:rPr>
+          <w:rFonts w:cstheme="minorHAnsi"/>
+          <w:i/>
+          <w:iCs/>
+        </w:rPr>
+        <w:t>Object Count</w:t>
+      </w:r>
+      <w:r>
+        <w:rPr>
+          <w:rFonts w:cstheme="minorHAnsi"/>
+        </w:rPr>
+        <w:t xml:space="preserve"> and </w:t>
+      </w:r>
+      <w:r>
+        <w:rPr>
+          <w:rFonts w:cstheme="minorHAnsi"/>
+          <w:i/>
+          <w:iCs/>
+        </w:rPr>
+        <w:t>Region Area (</w:t>
+      </w:r>
+      <w:r>
+        <w:rPr>
+          <w:rFonts w:cstheme="minorHAnsi"/>
+          <w:color w:val="111111"/>
+          <w:shd w:val="clear" w:color="auto" w:fill="FFFFFF"/>
+        </w:rPr>
+        <w:t>μm</w:t>
+      </w:r>
+      <w:r>
+        <w:rPr>
+          <w:rFonts w:cstheme="minorHAnsi"/>
+          <w:i/>
+          <w:iCs/>
+        </w:rPr>
+        <w:t xml:space="preserve">^2): </w:t>
+      </w:r>
+      <w:r>
+        <w:rPr>
+          <w:rFonts w:cstheme="minorHAnsi"/>
+        </w:rPr>
+        <w:t xml:space="preserve">the app divides object counts (+ cells) by the region area converted to mm^2 (area in </w:t>
+      </w:r>
+      <w:r>
+        <w:rPr>
+          <w:rFonts w:cstheme="minorHAnsi"/>
+          <w:color w:val="111111"/>
+          <w:shd w:val="clear" w:color="auto" w:fill="FFFFFF"/>
+        </w:rPr>
+        <w:t>μm</w:t>
+      </w:r>
+      <w:r>
+        <w:rPr>
+          <w:rFonts w:cstheme="minorHAnsi"/>
+        </w:rPr>
+        <w:t>^2 * 10^-6) for each region.</w:t>
+      </w:r>
+      <w:r>
+        <w:rPr>
+          <w:rFonts w:cstheme="minorHAnsi"/>
+        </w:rPr>
+        <w:t xml:space="preserve"> </w:t>
+      </w:r>
+      <w:r>
+        <w:rPr>
+          <w:rFonts w:cstheme="minorHAnsi"/>
+        </w:rPr>
+        <w:t xml:space="preserve">If </w:t>
+      </w:r>
+      <w:r>
+        <w:rPr>
+          <w:rFonts w:cstheme="minorHAnsi"/>
+        </w:rPr>
+        <w:t xml:space="preserve">you select </w:t>
+      </w:r>
+      <w:r>
+        <w:rPr>
+          <w:rFonts w:cstheme="minorHAnsi"/>
+        </w:rPr>
+        <w:t>a region level</w:t>
+      </w:r>
+      <w:r>
+        <w:rPr>
+          <w:rFonts w:cstheme="minorHAnsi"/>
+        </w:rPr>
+        <w:t xml:space="preserve"> higher than daughter, it will add up the sub region areas</w:t>
+      </w:r>
+      <w:r>
+        <w:rPr>
+          <w:rFonts w:cstheme="minorHAnsi"/>
+        </w:rPr>
+        <w:t xml:space="preserve"> and inclusions</w:t>
+      </w:r>
+      <w:r>
+        <w:rPr>
+          <w:rFonts w:cstheme="minorHAnsi"/>
+        </w:rPr>
+        <w:t xml:space="preserve"> and then </w:t>
+      </w:r>
+      <w:r>
+        <w:rPr>
+          <w:rFonts w:cstheme="minorHAnsi"/>
+        </w:rPr>
+        <w:t>use those</w:t>
+      </w:r>
+      <w:r>
+        <w:rPr>
+          <w:rFonts w:cstheme="minorHAnsi"/>
+        </w:rPr>
+        <w:t xml:space="preserve"> for the larger region.</w:t>
+      </w:r>
+    </w:p>
+    <w:p>
+      <w:pPr>
+        <w:pStyle w:val="ListParagraph"/>
+        <w:numPr>
+          <w:ilvl w:val="1"/>
+          <w:numId w:val="7"/>
+        </w:numPr>
+        <w:rPr>
+          <w:rFonts w:cstheme="minorHAnsi"/>
+        </w:rPr>
+      </w:pPr>
+      <w:r>
+        <w:rPr>
+          <w:rFonts w:cstheme="minorHAnsi"/>
+        </w:rPr>
+        <w:t>Be sure you turn off the setting for Object Splitting in Nutil, otherwise you’ll end up with NAs in the column for Object Count in the Nutil outputs and this measure will not run.</w:t>
       </w:r>
     </w:p>
     <w:sectPr>
@@ -4630,6 +4644,18 @@
   </w:num>
   <w:num w:numId="9" w16cid:durableId="1767341401">
     <w:abstractNumId w:val="0"/>
+  </w:num>
+  <w:num w:numId="10" w16cid:durableId="856432134">
+    <w:abstractNumId w:val="5"/>
+    <w:lvlOverride w:ilvl="0"/>
+    <w:lvlOverride w:ilvl="1"/>
+    <w:lvlOverride w:ilvl="2"/>
+    <w:lvlOverride w:ilvl="3"/>
+    <w:lvlOverride w:ilvl="4"/>
+    <w:lvlOverride w:ilvl="5"/>
+    <w:lvlOverride w:ilvl="6"/>
+    <w:lvlOverride w:ilvl="7"/>
+    <w:lvlOverride w:ilvl="8"/>
   </w:num>
 </w:numbering>
 </file>
@@ -5059,6 +5085,7 @@
   <w:style w:type="character" w:default="1" w:styleId="DefaultParagraphFont">
     <w:name w:val="Default Paragraph Font"/>
     <w:uiPriority w:val="1"/>
+    <w:semiHidden/>
     <w:unhideWhenUsed/>
   </w:style>
   <w:style w:type="table" w:default="1" w:styleId="TableNormal">

</xml_diff>